<commit_message>
docs(dao): demande backend — pieces de l'offre ouvertes aux fournitures (choix A du pilote) ; DPAO-F 6.2 sur {{PIECES.*}} avec un paragraphe « Pieces administratives » ajoute (B03-CQ-01 ne s'imprimait plus nulle part) — en attente de validation du texte
Co-Authored-By: Claude Opus 5.5 (1M context) <noreply@anthropic.com>
</commit_message>
<xml_diff>
--- a/docs/modeles-dao/DPAO-F.docx
+++ b/docs/modeles-dao/DPAO-F.docx
@@ -903,7 +903,119 @@
               <w:rPr>
                 <w:sz w:val="20"/>
               </w:rPr>
+              <w:t>{{SI:PIECES-OFFRE-LISTE}}</w:t>
+            </w:r>
+          </w:p>
+          <w:p>
+            <w:r>
+              <w:rPr>
+                <w:sz w:val="20"/>
+              </w:rPr>
+              <w:t>{{PIECES.offre}}</w:t>
+            </w:r>
+          </w:p>
+          <w:p>
+            <w:r>
+              <w:rPr>
+                <w:sz w:val="20"/>
+              </w:rPr>
+              <w:t>{{FINSI:PIECES-OFFRE-LISTE}}</w:t>
+            </w:r>
+          </w:p>
+          <w:p>
+            <w:r>
+              <w:rPr>
+                <w:sz w:val="20"/>
+              </w:rPr>
+              <w:t>{{SI:PIECES-OFFRE-TEXTE}}</w:t>
+            </w:r>
+          </w:p>
+          <w:p>
+            <w:r>
+              <w:rPr>
+                <w:sz w:val="20"/>
+              </w:rPr>
               <w:t>{{B04-CO-01}}</w:t>
+            </w:r>
+          </w:p>
+          <w:p>
+            <w:r>
+              <w:rPr>
+                <w:sz w:val="20"/>
+              </w:rPr>
+              <w:t>{{FINSI:PIECES-OFFRE-TEXTE}}</w:t>
+            </w:r>
+          </w:p>
+          <w:p>
+            <w:r>
+              <w:rPr>
+                <w:sz w:val="20"/>
+              </w:rPr>
+              <w:t>{{SI:PIECES-ADM}}</w:t>
+            </w:r>
+          </w:p>
+          <w:p>
+            <w:r>
+              <w:rPr>
+                <w:sz w:val="20"/>
+              </w:rPr>
+              <w:t>Pièces administratives à joindre à l’offre :</w:t>
+            </w:r>
+          </w:p>
+          <w:p>
+            <w:r>
+              <w:rPr>
+                <w:sz w:val="20"/>
+              </w:rPr>
+              <w:t>{{FINSI:PIECES-ADM}}</w:t>
+            </w:r>
+          </w:p>
+          <w:p>
+            <w:r>
+              <w:rPr>
+                <w:sz w:val="20"/>
+              </w:rPr>
+              <w:t>{{SI:PIECES-ADM-LISTE}}</w:t>
+            </w:r>
+          </w:p>
+          <w:p>
+            <w:r>
+              <w:rPr>
+                <w:sz w:val="20"/>
+              </w:rPr>
+              <w:t>{{PIECES.administratives}}</w:t>
+            </w:r>
+          </w:p>
+          <w:p>
+            <w:r>
+              <w:rPr>
+                <w:sz w:val="20"/>
+              </w:rPr>
+              <w:t>{{FINSI:PIECES-ADM-LISTE}}</w:t>
+            </w:r>
+          </w:p>
+          <w:p>
+            <w:r>
+              <w:rPr>
+                <w:sz w:val="20"/>
+              </w:rPr>
+              <w:t>{{SI:PIECES-ADM-TEXTE}}</w:t>
+            </w:r>
+          </w:p>
+          <w:p>
+            <w:r>
+              <w:rPr>
+                <w:sz w:val="20"/>
+              </w:rPr>
+              <w:t>{{B03-CQ-01}}</w:t>
+            </w:r>
+          </w:p>
+          <w:p>
+            <w:r>
+              <w:rPr>
+                <w:sz w:val="20"/>
+              </w:rPr>
+              <w:t>{{FINSI:PIECES-ADM-TEXTE}}</w:t>
             </w:r>
           </w:p>
         </w:tc>

</xml_diff>